<commit_message>
Cover remaining feedback: tasks balloon, log tools, drawer search, counters
- Tasks balloon (⏱): running/pending jobs, progress, ECA download counters
  with rate via download_stats broadcast, stop button
- Live log: copy/download/maximize buttons, red errors / green successes,
  clearer tab separation
- Cases drawer: free-text search (client/case/party), full ערכאה grouping
  incl. הוצאה לפועל, closed cases red and last
- Main dashboard: client column in recent documents
- Sync: clarified NET-locator label (existing cases → Cases tab search)
- /api/jobs exposed through the app for the balloon
- Guides: feature-by-feature reference table + pipeline description (HE+EN)

Co-Authored-By: Claude Fable 5 <noreply@anthropic.com>
</commit_message>
<xml_diff>
--- a/LIAS_User_Guide_EN.docx
+++ b/LIAS_User_Guide_EN.docx
@@ -1215,7 +1215,793 @@
         <w:rPr>
           <w:rFonts w:ascii="Arial" w:cs="Arial" w:eastAsia="Arial" w:hAnsi="Arial"/>
         </w:rPr>
-        <w:t xml:space="preserve">10. Improvement ideas</w:t>
+        <w:t xml:space="preserve">10. Feature reference — what everything does</w:t>
+      </w:r>
+    </w:p>
+    <w:tbl>
+      <w:tblPr>
+        <w:bidiVisual w:val="false"/>
+        <w:tblW w:type="dxa" w:w="9200"/>
+        <w:tblBorders>
+          <w:top w:val="single" w:color="auto" w:sz="4"/>
+          <w:left w:val="single" w:color="auto" w:sz="4"/>
+          <w:bottom w:val="single" w:color="auto" w:sz="4"/>
+          <w:right w:val="single" w:color="auto" w:sz="4"/>
+          <w:insideH w:val="single" w:color="auto" w:sz="4"/>
+          <w:insideV w:val="single" w:color="auto" w:sz="4"/>
+        </w:tblBorders>
+      </w:tblPr>
+      <w:tblGrid>
+        <w:gridCol w:w="2600"/>
+        <w:gridCol w:w="6600"/>
+      </w:tblGrid>
+      <w:tr>
+        <w:tc>
+          <w:tcPr>
+            <w:tcW w:type="dxa" w:w="2600"/>
+            <w:shd w:fill="DCE9FB" w:val="clear"/>
+          </w:tcPr>
+          <w:p>
+            <w:pPr>
+              <w:bidi w:val="false"/>
+            </w:pPr>
+            <w:r>
+              <w:rPr>
+                <w:rFonts w:ascii="Arial" w:cs="Arial" w:eastAsia="Arial" w:hAnsi="Arial"/>
+                <w:b/>
+                <w:bCs/>
+                <w:sz w:val="20"/>
+                <w:szCs w:val="20"/>
+                <w:rtl w:val="false"/>
+              </w:rPr>
+              <w:t xml:space="preserve">Feature</w:t>
+            </w:r>
+          </w:p>
+        </w:tc>
+        <w:tc>
+          <w:tcPr>
+            <w:tcW w:type="dxa" w:w="6600"/>
+            <w:shd w:fill="DCE9FB" w:val="clear"/>
+          </w:tcPr>
+          <w:p>
+            <w:pPr>
+              <w:bidi w:val="false"/>
+            </w:pPr>
+            <w:r>
+              <w:rPr>
+                <w:rFonts w:ascii="Arial" w:cs="Arial" w:eastAsia="Arial" w:hAnsi="Arial"/>
+                <w:b/>
+                <w:bCs/>
+                <w:sz w:val="20"/>
+                <w:szCs w:val="20"/>
+                <w:rtl w:val="false"/>
+              </w:rPr>
+              <w:t xml:space="preserve">What it does</w:t>
+            </w:r>
+          </w:p>
+        </w:tc>
+      </w:tr>
+      <w:tr>
+        <w:tc>
+          <w:tcPr>
+            <w:tcW w:type="dxa" w:w="2600"/>
+          </w:tcPr>
+          <w:p>
+            <w:pPr>
+              <w:bidi w:val="false"/>
+            </w:pPr>
+            <w:r>
+              <w:rPr>
+                <w:rFonts w:ascii="Arial" w:cs="Arial" w:eastAsia="Arial" w:hAnsi="Arial"/>
+                <w:b w:val="false"/>
+                <w:bCs w:val="false"/>
+                <w:sz w:val="20"/>
+                <w:szCs w:val="20"/>
+                <w:rtl w:val="false"/>
+              </w:rPr>
+              <w:t xml:space="preserve">Main dashboard</w:t>
+            </w:r>
+          </w:p>
+        </w:tc>
+        <w:tc>
+          <w:tcPr>
+            <w:tcW w:type="dxa" w:w="6600"/>
+          </w:tcPr>
+          <w:p>
+            <w:pPr>
+              <w:bidi w:val="false"/>
+            </w:pPr>
+            <w:r>
+              <w:rPr>
+                <w:rFonts w:ascii="Arial" w:cs="Arial" w:eastAsia="Arial" w:hAnsi="Arial"/>
+                <w:b w:val="false"/>
+                <w:bCs w:val="false"/>
+                <w:sz w:val="20"/>
+                <w:szCs w:val="20"/>
+                <w:rtl w:val="false"/>
+              </w:rPr>
+              <w:t xml:space="preserve">KPIs, charts, recent documents with a client column, clickable breakdowns</w:t>
+            </w:r>
+          </w:p>
+        </w:tc>
+      </w:tr>
+      <w:tr>
+        <w:tc>
+          <w:tcPr>
+            <w:tcW w:type="dxa" w:w="2600"/>
+          </w:tcPr>
+          <w:p>
+            <w:pPr>
+              <w:bidi w:val="false"/>
+            </w:pPr>
+            <w:r>
+              <w:rPr>
+                <w:rFonts w:ascii="Arial" w:cs="Arial" w:eastAsia="Arial" w:hAnsi="Arial"/>
+                <w:b w:val="false"/>
+                <w:bCs w:val="false"/>
+                <w:sz w:val="20"/>
+                <w:szCs w:val="20"/>
+                <w:rtl w:val="false"/>
+              </w:rPr>
+              <w:t xml:space="preserve">Client dashboard</w:t>
+            </w:r>
+          </w:p>
+        </w:tc>
+        <w:tc>
+          <w:tcPr>
+            <w:tcW w:type="dxa" w:w="6600"/>
+          </w:tcPr>
+          <w:p>
+            <w:pPr>
+              <w:bidi w:val="false"/>
+            </w:pPr>
+            <w:r>
+              <w:rPr>
+                <w:rFonts w:ascii="Arial" w:cs="Arial" w:eastAsia="Arial" w:hAnsi="Arial"/>
+                <w:b w:val="false"/>
+                <w:bCs w:val="false"/>
+                <w:sz w:val="20"/>
+                <w:szCs w:val="20"/>
+                <w:rtl w:val="false"/>
+              </w:rPr>
+              <w:t xml:space="preserve">Collapsible hierarchy: court → main case → sub-cases; KPI cards open filtered lists</w:t>
+            </w:r>
+          </w:p>
+        </w:tc>
+      </w:tr>
+      <w:tr>
+        <w:tc>
+          <w:tcPr>
+            <w:tcW w:type="dxa" w:w="2600"/>
+          </w:tcPr>
+          <w:p>
+            <w:pPr>
+              <w:bidi w:val="false"/>
+            </w:pPr>
+            <w:r>
+              <w:rPr>
+                <w:rFonts w:ascii="Arial" w:cs="Arial" w:eastAsia="Arial" w:hAnsi="Arial"/>
+                <w:b w:val="false"/>
+                <w:bCs w:val="false"/>
+                <w:sz w:val="20"/>
+                <w:szCs w:val="20"/>
+                <w:rtl w:val="false"/>
+              </w:rPr>
+              <w:t xml:space="preserve">Cases tab</w:t>
+            </w:r>
+          </w:p>
+        </w:tc>
+        <w:tc>
+          <w:tcPr>
+            <w:tcW w:type="dxa" w:w="6600"/>
+          </w:tcPr>
+          <w:p>
+            <w:pPr>
+              <w:bidi w:val="false"/>
+            </w:pPr>
+            <w:r>
+              <w:rPr>
+                <w:rFonts w:ascii="Arial" w:cs="Arial" w:eastAsia="Arial" w:hAnsi="Arial"/>
+                <w:b w:val="false"/>
+                <w:bCs w:val="false"/>
+                <w:sz w:val="20"/>
+                <w:szCs w:val="20"/>
+                <w:rtl w:val="false"/>
+              </w:rPr>
+              <w:t xml:space="preserve">All cases by client &amp; court, free search (client/number/party), open-green first, closed-red last</w:t>
+            </w:r>
+          </w:p>
+        </w:tc>
+      </w:tr>
+      <w:tr>
+        <w:tc>
+          <w:tcPr>
+            <w:tcW w:type="dxa" w:w="2600"/>
+          </w:tcPr>
+          <w:p>
+            <w:pPr>
+              <w:bidi w:val="false"/>
+            </w:pPr>
+            <w:r>
+              <w:rPr>
+                <w:rFonts w:ascii="Arial" w:cs="Arial" w:eastAsia="Arial" w:hAnsi="Arial"/>
+                <w:b w:val="false"/>
+                <w:bCs w:val="false"/>
+                <w:sz w:val="20"/>
+                <w:szCs w:val="20"/>
+                <w:rtl w:val="false"/>
+              </w:rPr>
+              <w:t xml:space="preserve">NET sync</w:t>
+            </w:r>
+          </w:p>
+        </w:tc>
+        <w:tc>
+          <w:tcPr>
+            <w:tcW w:type="dxa" w:w="6600"/>
+          </w:tcPr>
+          <w:p>
+            <w:pPr>
+              <w:bidi w:val="false"/>
+            </w:pPr>
+            <w:r>
+              <w:rPr>
+                <w:rFonts w:ascii="Arial" w:cs="Arial" w:eastAsia="Arial" w:hAnsi="Arial"/>
+                <w:b w:val="false"/>
+                <w:bCs w:val="false"/>
+                <w:sz w:val="20"/>
+                <w:szCs w:val="20"/>
+                <w:rtl w:val="false"/>
+              </w:rPr>
+              <w:t xml:space="preserve">Scan open case / smart download / "My Cases" by date range; attachments (+) download automatically</w:t>
+            </w:r>
+          </w:p>
+        </w:tc>
+      </w:tr>
+      <w:tr>
+        <w:tc>
+          <w:tcPr>
+            <w:tcW w:type="dxa" w:w="2600"/>
+          </w:tcPr>
+          <w:p>
+            <w:pPr>
+              <w:bidi w:val="false"/>
+            </w:pPr>
+            <w:r>
+              <w:rPr>
+                <w:rFonts w:ascii="Arial" w:cs="Arial" w:eastAsia="Arial" w:hAnsi="Arial"/>
+                <w:b w:val="false"/>
+                <w:bCs w:val="false"/>
+                <w:sz w:val="20"/>
+                <w:szCs w:val="20"/>
+                <w:rtl w:val="false"/>
+              </w:rPr>
+              <w:t xml:space="preserve">BDR sync</w:t>
+            </w:r>
+          </w:p>
+        </w:tc>
+        <w:tc>
+          <w:tcPr>
+            <w:tcW w:type="dxa" w:w="6600"/>
+          </w:tcPr>
+          <w:p>
+            <w:pPr>
+              <w:bidi w:val="false"/>
+            </w:pPr>
+            <w:r>
+              <w:rPr>
+                <w:rFonts w:ascii="Arial" w:cs="Arial" w:eastAsia="Arial" w:hAnsi="Arial"/>
+                <w:b w:val="false"/>
+                <w:bCs w:val="false"/>
+                <w:sz w:val="20"/>
+                <w:szCs w:val="20"/>
+                <w:rtl w:val="false"/>
+              </w:rPr>
+              <w:t xml:space="preserve">All or by client name; two-tier discovery; automatic per-case client attribution after the run</w:t>
+            </w:r>
+          </w:p>
+        </w:tc>
+      </w:tr>
+      <w:tr>
+        <w:tc>
+          <w:tcPr>
+            <w:tcW w:type="dxa" w:w="2600"/>
+          </w:tcPr>
+          <w:p>
+            <w:pPr>
+              <w:bidi w:val="false"/>
+            </w:pPr>
+            <w:r>
+              <w:rPr>
+                <w:rFonts w:ascii="Arial" w:cs="Arial" w:eastAsia="Arial" w:hAnsi="Arial"/>
+                <w:b w:val="false"/>
+                <w:bCs w:val="false"/>
+                <w:sz w:val="20"/>
+                <w:szCs w:val="20"/>
+                <w:rtl w:val="false"/>
+              </w:rPr>
+              <w:t xml:space="preserve">ECA sync</w:t>
+            </w:r>
+          </w:p>
+        </w:tc>
+        <w:tc>
+          <w:tcPr>
+            <w:tcW w:type="dxa" w:w="6600"/>
+          </w:tcPr>
+          <w:p>
+            <w:pPr>
+              <w:bidi w:val="false"/>
+            </w:pPr>
+            <w:r>
+              <w:rPr>
+                <w:rFonts w:ascii="Arial" w:cs="Arial" w:eastAsia="Arial" w:hAnsi="Arial"/>
+                <w:b w:val="false"/>
+                <w:bCs w:val="false"/>
+                <w:sz w:val="20"/>
+                <w:szCs w:val="20"/>
+                <w:rtl w:val="false"/>
+              </w:rPr>
+              <w:t xml:space="preserve">All or specific cases; motions &amp; decisions per process; parties harvested on first visit; unavailable docs skipped</w:t>
+            </w:r>
+          </w:p>
+        </w:tc>
+      </w:tr>
+      <w:tr>
+        <w:tc>
+          <w:tcPr>
+            <w:tcW w:type="dxa" w:w="2600"/>
+          </w:tcPr>
+          <w:p>
+            <w:pPr>
+              <w:bidi w:val="false"/>
+            </w:pPr>
+            <w:r>
+              <w:rPr>
+                <w:rFonts w:ascii="Arial" w:cs="Arial" w:eastAsia="Arial" w:hAnsi="Arial"/>
+                <w:b w:val="false"/>
+                <w:bCs w:val="false"/>
+                <w:sz w:val="20"/>
+                <w:szCs w:val="20"/>
+                <w:rtl w:val="false"/>
+              </w:rPr>
+              <w:t xml:space="preserve">Document viewer</w:t>
+            </w:r>
+          </w:p>
+        </w:tc>
+        <w:tc>
+          <w:tcPr>
+            <w:tcW w:type="dxa" w:w="6600"/>
+          </w:tcPr>
+          <w:p>
+            <w:pPr>
+              <w:bidi w:val="false"/>
+            </w:pPr>
+            <w:r>
+              <w:rPr>
+                <w:rFonts w:ascii="Arial" w:cs="Arial" w:eastAsia="Arial" w:hAnsi="Arial"/>
+                <w:b w:val="false"/>
+                <w:bCs w:val="false"/>
+                <w:sz w:val="20"/>
+                <w:szCs w:val="20"/>
+                <w:rtl w:val="false"/>
+              </w:rPr>
+              <w:t xml:space="preserve">PDF/Word in-app, dock-to-side with dual scrolling, arrow navigation, date sorting</w:t>
+            </w:r>
+          </w:p>
+        </w:tc>
+      </w:tr>
+      <w:tr>
+        <w:tc>
+          <w:tcPr>
+            <w:tcW w:type="dxa" w:w="2600"/>
+          </w:tcPr>
+          <w:p>
+            <w:pPr>
+              <w:bidi w:val="false"/>
+            </w:pPr>
+            <w:r>
+              <w:rPr>
+                <w:rFonts w:ascii="Arial" w:cs="Arial" w:eastAsia="Arial" w:hAnsi="Arial"/>
+                <w:b w:val="false"/>
+                <w:bCs w:val="false"/>
+                <w:sz w:val="20"/>
+                <w:szCs w:val="20"/>
+                <w:rtl w:val="false"/>
+              </w:rPr>
+              <w:t xml:space="preserve">Add documents</w:t>
+            </w:r>
+          </w:p>
+        </w:tc>
+        <w:tc>
+          <w:tcPr>
+            <w:tcW w:type="dxa" w:w="6600"/>
+          </w:tcPr>
+          <w:p>
+            <w:pPr>
+              <w:bidi w:val="false"/>
+            </w:pPr>
+            <w:r>
+              <w:rPr>
+                <w:rFonts w:ascii="Arial" w:cs="Arial" w:eastAsia="Arial" w:hAnsi="Arial"/>
+                <w:b w:val="false"/>
+                <w:bCs w:val="false"/>
+                <w:sz w:val="20"/>
+                <w:szCs w:val="20"/>
+                <w:rtl w:val="false"/>
+              </w:rPr>
+              <w:t xml:space="preserve">Upload external files into a case, tagged "not from the case file"</w:t>
+            </w:r>
+          </w:p>
+        </w:tc>
+      </w:tr>
+      <w:tr>
+        <w:tc>
+          <w:tcPr>
+            <w:tcW w:type="dxa" w:w="2600"/>
+          </w:tcPr>
+          <w:p>
+            <w:pPr>
+              <w:bidi w:val="false"/>
+            </w:pPr>
+            <w:r>
+              <w:rPr>
+                <w:rFonts w:ascii="Arial" w:cs="Arial" w:eastAsia="Arial" w:hAnsi="Arial"/>
+                <w:b w:val="false"/>
+                <w:bCs w:val="false"/>
+                <w:sz w:val="20"/>
+                <w:szCs w:val="20"/>
+                <w:rtl w:val="false"/>
+              </w:rPr>
+              <w:t xml:space="preserve">Tasks balloon</w:t>
+            </w:r>
+          </w:p>
+        </w:tc>
+        <w:tc>
+          <w:tcPr>
+            <w:tcW w:type="dxa" w:w="6600"/>
+          </w:tcPr>
+          <w:p>
+            <w:pPr>
+              <w:bidi w:val="false"/>
+            </w:pPr>
+            <w:r>
+              <w:rPr>
+                <w:rFonts w:ascii="Arial" w:cs="Arial" w:eastAsia="Arial" w:hAnsi="Arial"/>
+                <w:b w:val="false"/>
+                <w:bCs w:val="false"/>
+                <w:sz w:val="20"/>
+                <w:szCs w:val="20"/>
+                <w:rtl w:val="false"/>
+              </w:rPr>
+              <w:t xml:space="preserve">What runs now and what waits, progress bar, document counter &amp; rate, stop button</w:t>
+            </w:r>
+          </w:p>
+        </w:tc>
+      </w:tr>
+      <w:tr>
+        <w:tc>
+          <w:tcPr>
+            <w:tcW w:type="dxa" w:w="2600"/>
+          </w:tcPr>
+          <w:p>
+            <w:pPr>
+              <w:bidi w:val="false"/>
+            </w:pPr>
+            <w:r>
+              <w:rPr>
+                <w:rFonts w:ascii="Arial" w:cs="Arial" w:eastAsia="Arial" w:hAnsi="Arial"/>
+                <w:b w:val="false"/>
+                <w:bCs w:val="false"/>
+                <w:sz w:val="20"/>
+                <w:szCs w:val="20"/>
+                <w:rtl w:val="false"/>
+              </w:rPr>
+              <w:t xml:space="preserve">Live log</w:t>
+            </w:r>
+          </w:p>
+        </w:tc>
+        <w:tc>
+          <w:tcPr>
+            <w:tcW w:type="dxa" w:w="6600"/>
+          </w:tcPr>
+          <w:p>
+            <w:pPr>
+              <w:bidi w:val="false"/>
+            </w:pPr>
+            <w:r>
+              <w:rPr>
+                <w:rFonts w:ascii="Arial" w:cs="Arial" w:eastAsia="Arial" w:hAnsi="Arial"/>
+                <w:b w:val="false"/>
+                <w:bCs w:val="false"/>
+                <w:sz w:val="20"/>
+                <w:szCs w:val="20"/>
+                <w:rtl w:val="false"/>
+              </w:rPr>
+              <w:t xml:space="preserve">General/Drive/Transcription/Events tabs; errors red, successes green; copy, download, maximize</w:t>
+            </w:r>
+          </w:p>
+        </w:tc>
+      </w:tr>
+      <w:tr>
+        <w:tc>
+          <w:tcPr>
+            <w:tcW w:type="dxa" w:w="2600"/>
+          </w:tcPr>
+          <w:p>
+            <w:pPr>
+              <w:bidi w:val="false"/>
+            </w:pPr>
+            <w:r>
+              <w:rPr>
+                <w:rFonts w:ascii="Arial" w:cs="Arial" w:eastAsia="Arial" w:hAnsi="Arial"/>
+                <w:b w:val="false"/>
+                <w:bCs w:val="false"/>
+                <w:sz w:val="20"/>
+                <w:szCs w:val="20"/>
+                <w:rtl w:val="false"/>
+              </w:rPr>
+              <w:t xml:space="preserve">Transcription</w:t>
+            </w:r>
+          </w:p>
+        </w:tc>
+        <w:tc>
+          <w:tcPr>
+            <w:tcW w:type="dxa" w:w="6600"/>
+          </w:tcPr>
+          <w:p>
+            <w:pPr>
+              <w:bidi w:val="false"/>
+            </w:pPr>
+            <w:r>
+              <w:rPr>
+                <w:rFonts w:ascii="Arial" w:cs="Arial" w:eastAsia="Arial" w:hAnsi="Arial"/>
+                <w:b w:val="false"/>
+                <w:bCs w:val="false"/>
+                <w:sz w:val="20"/>
+                <w:szCs w:val="20"/>
+                <w:rtl w:val="false"/>
+              </w:rPr>
+              <w:t xml:space="preserve">Split, 16 kHz conversion, parallel Hebrew-model transcription, partial saves</w:t>
+            </w:r>
+          </w:p>
+        </w:tc>
+      </w:tr>
+      <w:tr>
+        <w:tc>
+          <w:tcPr>
+            <w:tcW w:type="dxa" w:w="2600"/>
+          </w:tcPr>
+          <w:p>
+            <w:pPr>
+              <w:bidi w:val="false"/>
+            </w:pPr>
+            <w:r>
+              <w:rPr>
+                <w:rFonts w:ascii="Arial" w:cs="Arial" w:eastAsia="Arial" w:hAnsi="Arial"/>
+                <w:b w:val="false"/>
+                <w:bCs w:val="false"/>
+                <w:sz w:val="20"/>
+                <w:szCs w:val="20"/>
+                <w:rtl w:val="false"/>
+              </w:rPr>
+              <w:t xml:space="preserve">Pinboard</w:t>
+            </w:r>
+          </w:p>
+        </w:tc>
+        <w:tc>
+          <w:tcPr>
+            <w:tcW w:type="dxa" w:w="6600"/>
+          </w:tcPr>
+          <w:p>
+            <w:pPr>
+              <w:bidi w:val="false"/>
+            </w:pPr>
+            <w:r>
+              <w:rPr>
+                <w:rFonts w:ascii="Arial" w:cs="Arial" w:eastAsia="Arial" w:hAnsi="Arial"/>
+                <w:b w:val="false"/>
+                <w:bCs w:val="false"/>
+                <w:sz w:val="20"/>
+                <w:szCs w:val="20"/>
+                <w:rtl w:val="false"/>
+              </w:rPr>
+              <w:t xml:space="preserve">File documents under topics with notes</w:t>
+            </w:r>
+          </w:p>
+        </w:tc>
+      </w:tr>
+      <w:tr>
+        <w:tc>
+          <w:tcPr>
+            <w:tcW w:type="dxa" w:w="2600"/>
+          </w:tcPr>
+          <w:p>
+            <w:pPr>
+              <w:bidi w:val="false"/>
+            </w:pPr>
+            <w:r>
+              <w:rPr>
+                <w:rFonts w:ascii="Arial" w:cs="Arial" w:eastAsia="Arial" w:hAnsi="Arial"/>
+                <w:b w:val="false"/>
+                <w:bCs w:val="false"/>
+                <w:sz w:val="20"/>
+                <w:szCs w:val="20"/>
+                <w:rtl w:val="false"/>
+              </w:rPr>
+              <w:t xml:space="preserve">OCR/AI</w:t>
+            </w:r>
+          </w:p>
+        </w:tc>
+        <w:tc>
+          <w:tcPr>
+            <w:tcW w:type="dxa" w:w="6600"/>
+          </w:tcPr>
+          <w:p>
+            <w:pPr>
+              <w:bidi w:val="false"/>
+            </w:pPr>
+            <w:r>
+              <w:rPr>
+                <w:rFonts w:ascii="Arial" w:cs="Arial" w:eastAsia="Arial" w:hAnsi="Arial"/>
+                <w:b w:val="false"/>
+                <w:bCs w:val="false"/>
+                <w:sz w:val="20"/>
+                <w:szCs w:val="20"/>
+                <w:rtl w:val="false"/>
+              </w:rPr>
+              <w:t xml:space="preserve">Document → Markdown via Groq/xAI; key type auto-detected</w:t>
+            </w:r>
+          </w:p>
+        </w:tc>
+      </w:tr>
+    </w:tbl>
+    <w:p>
+      <w:pPr>
+        <w:pStyle w:val="Heading1"/>
+        <w:spacing w:after="120"/>
+      </w:pPr>
+      <w:r>
+        <w:rPr>
+          <w:rFonts w:ascii="Arial" w:cs="Arial" w:eastAsia="Arial" w:hAnsi="Arial"/>
+        </w:rPr>
+        <w:t xml:space="preserve">11. The pipeline — how data flows</w:t>
+      </w:r>
+    </w:p>
+    <w:p>
+      <w:pPr>
+        <w:pStyle w:val="ListParagraph"/>
+        <w:numPr>
+          <w:ilvl w:val="0"/>
+          <w:numId w:val="2"/>
+        </w:numPr>
+        <w:spacing w:after="120"/>
+      </w:pPr>
+      <w:r>
+        <w:rPr>
+          <w:rFonts w:ascii="Arial" w:cs="Arial" w:eastAsia="Arial" w:hAnsi="Arial"/>
+          <w:sz w:val="22"/>
+          <w:szCs w:val="22"/>
+        </w:rPr>
+        <w:t xml:space="preserve">1. A sync button click registers a job in the jobs table.</w:t>
+      </w:r>
+    </w:p>
+    <w:p>
+      <w:pPr>
+        <w:pStyle w:val="ListParagraph"/>
+        <w:numPr>
+          <w:ilvl w:val="0"/>
+          <w:numId w:val="2"/>
+        </w:numPr>
+        <w:spacing w:after="120"/>
+      </w:pPr>
+      <w:r>
+        <w:rPr>
+          <w:rFonts w:ascii="Arial" w:cs="Arial" w:eastAsia="Arial" w:hAnsi="Arial"/>
+          <w:sz w:val="22"/>
+          <w:szCs w:val="22"/>
+        </w:rPr>
+        <w:t xml:space="preserve">2. The in-process worker pool starts a hidden automation browser and logs in via gov.il — password from Keychain, one-time code from email.</w:t>
+      </w:r>
+    </w:p>
+    <w:p>
+      <w:pPr>
+        <w:pStyle w:val="ListParagraph"/>
+        <w:numPr>
+          <w:ilvl w:val="0"/>
+          <w:numId w:val="2"/>
+        </w:numPr>
+        <w:spacing w:after="120"/>
+      </w:pPr>
+      <w:r>
+        <w:rPr>
+          <w:rFonts w:ascii="Arial" w:cs="Arial" w:eastAsia="Arial" w:hAnsi="Arial"/>
+          <w:sz w:val="22"/>
+          <w:szCs w:val="22"/>
+        </w:rPr>
+        <w:t xml:space="preserve">3. The download runs per portal: NET (document grid), BDR (DevExpress), ECA (motions &amp; decisions, PDF captured from the API response).</w:t>
+      </w:r>
+    </w:p>
+    <w:p>
+      <w:pPr>
+        <w:pStyle w:val="ListParagraph"/>
+        <w:numPr>
+          <w:ilvl w:val="0"/>
+          <w:numId w:val="2"/>
+        </w:numPr>
+        <w:spacing w:after="120"/>
+      </w:pPr>
+      <w:r>
+        <w:rPr>
+          <w:rFonts w:ascii="Arial" w:cs="Arial" w:eastAsia="Arial" w:hAnsi="Arial"/>
+          <w:sz w:val="22"/>
+          <w:szCs w:val="22"/>
+        </w:rPr>
+        <w:t xml:space="preserve">4. Every file is saved under downloads/{client}/{case}/… and registered in a summary.csv manifest in the case folder.</w:t>
+      </w:r>
+    </w:p>
+    <w:p>
+      <w:pPr>
+        <w:pStyle w:val="ListParagraph"/>
+        <w:numPr>
+          <w:ilvl w:val="0"/>
+          <w:numId w:val="2"/>
+        </w:numPr>
+        <w:spacing w:after="120"/>
+      </w:pPr>
+      <w:r>
+        <w:rPr>
+          <w:rFonts w:ascii="Arial" w:cs="Arial" w:eastAsia="Arial" w:hAnsi="Arial"/>
+          <w:sz w:val="22"/>
+          <w:szCs w:val="22"/>
+        </w:rPr>
+        <w:t xml:space="preserve">5. After the run: client attribution (BDR), manifest import into SQLite (lias.db), and Drive upload if configured.</w:t>
+      </w:r>
+    </w:p>
+    <w:p>
+      <w:pPr>
+        <w:pStyle w:val="ListParagraph"/>
+        <w:numPr>
+          <w:ilvl w:val="0"/>
+          <w:numId w:val="2"/>
+        </w:numPr>
+        <w:spacing w:after="120"/>
+      </w:pPr>
+      <w:r>
+        <w:rPr>
+          <w:rFonts w:ascii="Arial" w:cs="Arial" w:eastAsia="Arial" w:hAnsi="Arial"/>
+          <w:sz w:val="22"/>
+          <w:szCs w:val="22"/>
+        </w:rPr>
+        <w:t xml:space="preserve">6. The dashboard reads lias.db only — everything imported appears immediately; live SSE events stream progress, counters and logs to the UI.</w:t>
+      </w:r>
+    </w:p>
+    <w:p>
+      <w:pPr>
+        <w:pStyle w:val="ListParagraph"/>
+        <w:numPr>
+          <w:ilvl w:val="0"/>
+          <w:numId w:val="2"/>
+        </w:numPr>
+        <w:spacing w:after="120"/>
+      </w:pPr>
+      <w:r>
+        <w:rPr>
+          <w:rFonts w:ascii="Arial" w:cs="Arial" w:eastAsia="Arial" w:hAnsi="Arial"/>
+          <w:sz w:val="22"/>
+          <w:szCs w:val="22"/>
+        </w:rPr>
+        <w:t xml:space="preserve">7. Transcription and OCR run as separate tracks over local files, saving their outputs (MD) next to the source.</w:t>
+      </w:r>
+    </w:p>
+    <w:p>
+      <w:pPr>
+        <w:pStyle w:val="Heading1"/>
+        <w:spacing w:after="120"/>
+      </w:pPr>
+      <w:r>
+        <w:rPr>
+          <w:rFonts w:ascii="Arial" w:cs="Arial" w:eastAsia="Arial" w:hAnsi="Arial"/>
+        </w:rPr>
+        <w:t xml:space="preserve">12. Improvement ideas</w:t>
       </w:r>
     </w:p>
     <w:p>

</xml_diff>